<commit_message>
Updated assignment documents and removed users sql.sql
</commit_message>
<xml_diff>
--- a/Assignments/assignment(sql).docx
+++ b/Assignments/assignment(sql).docx
@@ -14,33 +14,21 @@
           <w:b/>
           <w:bCs/>
         </w:rPr>
-        <w:t>1.</w:t>
-      </w:r>
-      <w:r>
-        <w:rPr>
-          <w:b/>
-          <w:bCs/>
-        </w:rPr>
-        <w:t>PRIMARY KEY</w:t>
-      </w:r>
-    </w:p>
-    <w:p>
-      <w:pPr>
-        <w:spacing w:before="100" w:beforeAutospacing="1" w:after="100" w:afterAutospacing="1" w:line="240" w:lineRule="auto"/>
-        <w:ind w:left="360"/>
-        <w:outlineLvl w:val="2"/>
+        <w:t>1.PRIMARY KEY</w:t>
+      </w:r>
+    </w:p>
+    <w:p>
+      <w:pPr>
+        <w:rPr>
+          <w:b/>
+          <w:bCs/>
+        </w:rPr>
+      </w:pPr>
+      <w:r>
         <w:rPr>
           <w:rFonts w:ascii="Times New Roman" w:eastAsia="Times New Roman" w:hAnsi="Times New Roman" w:cs="Times New Roman"/>
-          <w:kern w:val="0"/>
-          <w:sz w:val="27"/>
-          <w:szCs w:val="27"/>
-          <w:lang w:eastAsia="en-IN"/>
-          <w14:ligatures w14:val="none"/>
-        </w:rPr>
-      </w:pPr>
-      <w:r>
-        <w:rPr>
-          <w:rFonts w:ascii="Times New Roman" w:eastAsia="Times New Roman" w:hAnsi="Times New Roman" w:cs="Times New Roman"/>
+          <w:b/>
+          <w:bCs/>
           <w:kern w:val="0"/>
           <w:sz w:val="27"/>
           <w:szCs w:val="27"/>
@@ -176,8 +164,9 @@
           <w:lang w:eastAsia="en-IN"/>
           <w14:ligatures w14:val="none"/>
         </w:rPr>
-        <w:t xml:space="preserve">    name VARCHAR</w:t>
-      </w:r>
+        <w:t xml:space="preserve">    name </w:t>
+      </w:r>
+      <w:proofErr w:type="gramStart"/>
       <w:r>
         <w:rPr>
           <w:rFonts w:ascii="Courier New" w:eastAsia="Times New Roman" w:hAnsi="Courier New" w:cs="Courier New"/>
@@ -187,8 +176,20 @@
           <w:lang w:eastAsia="en-IN"/>
           <w14:ligatures w14:val="none"/>
         </w:rPr>
+        <w:t>VARCHAR</w:t>
+      </w:r>
+      <w:r>
+        <w:rPr>
+          <w:rFonts w:ascii="Courier New" w:eastAsia="Times New Roman" w:hAnsi="Courier New" w:cs="Courier New"/>
+          <w:kern w:val="0"/>
+          <w:sz w:val="20"/>
+          <w:szCs w:val="20"/>
+          <w:lang w:eastAsia="en-IN"/>
+          <w14:ligatures w14:val="none"/>
+        </w:rPr>
         <w:t>(</w:t>
       </w:r>
+      <w:proofErr w:type="gramEnd"/>
       <w:r>
         <w:rPr>
           <w:rFonts w:ascii="Courier New" w:eastAsia="Times New Roman" w:hAnsi="Courier New" w:cs="Courier New"/>
@@ -502,7 +503,19 @@
         <w:rPr>
           <w:rFonts w:ascii="Courier New" w:hAnsi="Courier New" w:cs="Courier New"/>
         </w:rPr>
-        <w:t>INSERT INTO Student VALUES (102, 'Anu');</w:t>
+        <w:t>INSERT INTO Student VALUES (102, '</w:t>
+      </w:r>
+      <w:r>
+        <w:rPr>
+          <w:rFonts w:ascii="Courier New" w:hAnsi="Courier New" w:cs="Courier New"/>
+        </w:rPr>
+        <w:t>Riya</w:t>
+      </w:r>
+      <w:r>
+        <w:rPr>
+          <w:rFonts w:ascii="Courier New" w:hAnsi="Courier New" w:cs="Courier New"/>
+        </w:rPr>
+        <w:t>');</w:t>
       </w:r>
     </w:p>
     <w:p>
@@ -759,7 +772,19 @@
         <w:rPr>
           <w:rFonts w:ascii="Courier New" w:hAnsi="Courier New" w:cs="Courier New"/>
         </w:rPr>
-        <w:t>INSERT INTO Student VALUES (102, 'Anu');</w:t>
+        <w:t>INSERT INTO Student VALUES (102, '</w:t>
+      </w:r>
+      <w:r>
+        <w:rPr>
+          <w:rFonts w:ascii="Courier New" w:hAnsi="Courier New" w:cs="Courier New"/>
+        </w:rPr>
+        <w:t>Riya</w:t>
+      </w:r>
+      <w:r>
+        <w:rPr>
+          <w:rFonts w:ascii="Courier New" w:hAnsi="Courier New" w:cs="Courier New"/>
+        </w:rPr>
+        <w:t>');</w:t>
       </w:r>
     </w:p>
     <w:p>
@@ -1043,7 +1068,19 @@
         <w:rPr>
           <w:rFonts w:ascii="Courier New" w:hAnsi="Courier New" w:cs="Courier New"/>
         </w:rPr>
-        <w:t>INSERT INTO Student VALUES (102, 'Anu');</w:t>
+        <w:t>INSERT INTO Student VALUES (102, '</w:t>
+      </w:r>
+      <w:r>
+        <w:rPr>
+          <w:rFonts w:ascii="Courier New" w:hAnsi="Courier New" w:cs="Courier New"/>
+        </w:rPr>
+        <w:t>Riya</w:t>
+      </w:r>
+      <w:r>
+        <w:rPr>
+          <w:rFonts w:ascii="Courier New" w:hAnsi="Courier New" w:cs="Courier New"/>
+        </w:rPr>
+        <w:t>');</w:t>
       </w:r>
     </w:p>
     <w:p>
@@ -3176,7 +3213,19 @@
         <w:rPr>
           <w:rFonts w:ascii="Courier New" w:hAnsi="Courier New" w:cs="Courier New"/>
         </w:rPr>
-        <w:t>INSERT INTO Student VALUES(2,'Anu');</w:t>
+        <w:t>INSERT INTO Student VALUES(2,'</w:t>
+      </w:r>
+      <w:r>
+        <w:rPr>
+          <w:rFonts w:ascii="Courier New" w:hAnsi="Courier New" w:cs="Courier New"/>
+        </w:rPr>
+        <w:t>Riya</w:t>
+      </w:r>
+      <w:r>
+        <w:rPr>
+          <w:rFonts w:ascii="Courier New" w:hAnsi="Courier New" w:cs="Courier New"/>
+        </w:rPr>
+        <w:t>');</w:t>
       </w:r>
     </w:p>
     <w:p>
@@ -6521,6 +6570,7 @@
   <w:style w:type="character" w:default="1" w:styleId="DefaultParagraphFont">
     <w:name w:val="Default Paragraph Font"/>
     <w:uiPriority w:val="1"/>
+    <w:semiHidden/>
     <w:unhideWhenUsed/>
   </w:style>
   <w:style w:type="table" w:default="1" w:styleId="TableNormal">

</xml_diff>